<commit_message>
fix: center owner and principal text
</commit_message>
<xml_diff>
--- a/official-template-fillable.docx
+++ b/official-template-fillable.docx
@@ -378,8 +378,12 @@
               <w:bottom w:w="0" w:type="dxa"/>
               <w:right w:w="108" w:type="dxa"/>
             </w:tcMar>
-          </w:tcPr>
-          <w:p>
+            <w:vAlign w:val="center"/>
+          </w:tcPr>
+          <w:p>
+            <w:pPr>
+              <w:jc w:val="left"/>
+            </w:pPr>
             <w:r>
               <w:rPr>
                 <w:rFonts w:ascii="標楷體" w:hAnsi="標楷體"/>
@@ -440,8 +444,12 @@
               <w:bottom w:w="0" w:type="dxa"/>
               <w:right w:w="108" w:type="dxa"/>
             </w:tcMar>
-          </w:tcPr>
-          <w:p>
+            <w:vAlign w:val="center"/>
+          </w:tcPr>
+          <w:p>
+            <w:pPr>
+              <w:jc w:val="left"/>
+            </w:pPr>
             <w:r>
               <w:rPr>
                 <w:rFonts w:ascii="標楷體" w:hAnsi="標楷體"/>

</xml_diff>